<commit_message>
Elimina punto 9 de Fase 2 (Gestión de incidentes críticos) y renumera
El punto consistía en una sola oración genérica que no aportaba contenido
operativo al documento. Documentos de consulta renumerado de 10 a 9.
</commit_message>
<xml_diff>
--- a/CRV_Orientaciones_Acceso_y_Legitimacion_2026_v5.docx
+++ b/CRV_Orientaciones_Acceso_y_Legitimacion_2026_v5.docx
@@ -5702,11 +5702,6 @@
         <w:pStyle w:val="Ttulo2"/>
         <w:rPr>
           <w:rFonts w:ascii="Arial" w:hAnsi="Arial" w:cs="Arial"/>
-        </w:rPr>
-      </w:pPr>
-      <w:r>
-        <w:rPr>
-          <w:rFonts w:ascii="Arial" w:hAnsi="Arial" w:cs="Arial"/>
           <w:b/>
           <w:bCs/>
           <w:color w:val="auto"/>
@@ -5714,8 +5709,7 @@
           <w:szCs w:val="24"/>
           <w:lang w:val="es-ES"/>
         </w:rPr>
-        <w:t>9</w:t>
-      </w:r>
+      </w:pPr>
       <w:r>
         <w:rPr>
           <w:rFonts w:ascii="Arial" w:hAnsi="Arial" w:cs="Arial"/>
@@ -5726,100 +5720,7 @@
           <w:szCs w:val="24"/>
           <w:lang w:val="es-ES"/>
         </w:rPr>
-        <w:t>. Gestión de incidentes críticos</w:t>
-      </w:r>
-      <w:r>
-        <w:rPr>
-          <w:rFonts w:ascii="Arial" w:hAnsi="Arial" w:cs="Arial"/>
-          <w:b/>
-          <w:bCs/>
-          <w:color w:val="auto"/>
-          <w:sz w:val="24"/>
-          <w:szCs w:val="24"/>
-          <w:lang w:val="es-ES"/>
-        </w:rPr>
-        <w:t xml:space="preserve">: </w:t>
-      </w:r>
-    </w:p>
-    <w:p>
-      <w:pPr>
-        <w:numPr>
-          <w:ilvl w:val="0"/>
-          <w:numId w:val="7"/>
-        </w:numPr>
-        <w:jc w:val="both"/>
-        <w:rPr>
-          <w:rFonts w:ascii="Arial" w:hAnsi="Arial" w:cs="Arial"/>
-          <w:lang w:val="es-ES"/>
-        </w:rPr>
-      </w:pPr>
-      <w:r>
-        <w:rPr>
-          <w:rFonts w:ascii="Arial" w:hAnsi="Arial" w:cs="Arial"/>
-        </w:rPr>
-        <w:t>A</w:t>
-      </w:r>
-      <w:r>
-        <w:rPr>
-          <w:rFonts w:ascii="Arial" w:hAnsi="Arial" w:cs="Arial"/>
-        </w:rPr>
-        <w:t xml:space="preserve">nte </w:t>
-      </w:r>
-      <w:r>
-        <w:rPr>
-          <w:rFonts w:ascii="Arial" w:hAnsi="Arial" w:cs="Arial"/>
-        </w:rPr>
-        <w:t>cualquier alteración del orden público</w:t>
-      </w:r>
-      <w:r>
-        <w:rPr>
-          <w:rFonts w:ascii="Arial" w:hAnsi="Arial" w:cs="Arial"/>
-        </w:rPr>
-        <w:t xml:space="preserve"> o </w:t>
-      </w:r>
-      <w:r>
-        <w:rPr>
-          <w:rFonts w:ascii="Arial" w:hAnsi="Arial" w:cs="Arial"/>
-        </w:rPr>
-        <w:t>amenaza</w:t>
-      </w:r>
-      <w:r>
-        <w:rPr>
-          <w:rFonts w:ascii="Arial" w:hAnsi="Arial" w:cs="Arial"/>
-        </w:rPr>
-        <w:t>,</w:t>
-      </w:r>
-      <w:r>
-        <w:rPr>
-          <w:rFonts w:ascii="Arial" w:hAnsi="Arial" w:cs="Arial"/>
-        </w:rPr>
-        <w:t xml:space="preserve"> el equipo debe seguir los protocolos de seguridad de la filial.</w:t>
-      </w:r>
-    </w:p>
-    <w:p>
-      <w:pPr>
-        <w:pStyle w:val="Ttulo2"/>
-        <w:rPr>
-          <w:rFonts w:ascii="Arial" w:hAnsi="Arial" w:cs="Arial"/>
-          <w:b/>
-          <w:bCs/>
-          <w:color w:val="auto"/>
-          <w:sz w:val="24"/>
-          <w:szCs w:val="24"/>
-          <w:lang w:val="es-ES"/>
-        </w:rPr>
-      </w:pPr>
-      <w:r>
-        <w:rPr>
-          <w:rFonts w:ascii="Arial" w:hAnsi="Arial" w:cs="Arial"/>
-          <w:b/>
-          <w:bCs/>
-          <w:color w:val="auto"/>
-          <w:sz w:val="24"/>
-          <w:szCs w:val="24"/>
-          <w:lang w:val="es-ES"/>
-        </w:rPr>
-        <w:t>10</w:t>
+        <w:t>9</w:t>
       </w:r>
       <w:r>
         <w:rPr>

</xml_diff>

<commit_message>
Fusiona puntos 4 y 5 de Fase 2 en uno solo y renumera
Combina "Gestión de los permisos" y "Matriz de decisión: cuándo notificar
a las autoridades" bajo el título "Gestión de permisos y notificación a
autoridades". Puntos siguientes renumerados del 6-9 al 5-8.
</commit_message>
<xml_diff>
--- a/CRV_Orientaciones_Acceso_y_Legitimacion_2026_v5.docx
+++ b/CRV_Orientaciones_Acceso_y_Legitimacion_2026_v5.docx
@@ -4698,7 +4698,7 @@
           <w:szCs w:val="24"/>
           <w:lang w:val="es-ES"/>
         </w:rPr>
-        <w:t>Gestión de los permisos</w:t>
+        <w:t>Gestión de permisos y notificación a autoridades</w:t>
       </w:r>
     </w:p>
     <w:p>
@@ -4841,44 +4841,6 @@
           <w:lang w:val="es-ES"/>
         </w:rPr>
         <w:t xml:space="preserve"> Entrar con el aval de la comunidad protege al personal ante las autoridades civiles o militares.</w:t>
-      </w:r>
-    </w:p>
-    <w:p>
-      <w:pPr>
-        <w:pStyle w:val="Ttulo2"/>
-        <w:rPr>
-          <w:rFonts w:ascii="Arial" w:hAnsi="Arial" w:cs="Arial"/>
-          <w:b/>
-          <w:bCs/>
-          <w:color w:val="auto"/>
-          <w:sz w:val="24"/>
-          <w:szCs w:val="24"/>
-          <w:lang w:val="es-ES"/>
-        </w:rPr>
-      </w:pPr>
-      <w:r>
-        <w:rPr>
-          <w:rFonts w:ascii="Arial" w:hAnsi="Arial" w:cs="Arial"/>
-          <w:b/>
-          <w:bCs/>
-          <w:color w:val="auto"/>
-          <w:sz w:val="24"/>
-          <w:szCs w:val="24"/>
-          <w:lang w:val="es-ES"/>
-        </w:rPr>
-        <w:t>5.</w:t>
-      </w:r>
-      <w:r>
-        <w:rPr>
-          <w:rFonts w:ascii="Arial" w:hAnsi="Arial" w:cs="Arial"/>
-          <w:b/>
-          <w:bCs/>
-          <w:color w:val="auto"/>
-          <w:sz w:val="24"/>
-          <w:szCs w:val="24"/>
-          <w:lang w:val="es-ES"/>
-        </w:rPr>
-        <w:t xml:space="preserve"> Matriz de decisión: cuándo notificar a las autoridades</w:t>
       </w:r>
     </w:p>
     <w:p>
@@ -5216,8 +5178,7 @@
           <w:szCs w:val="24"/>
           <w:lang w:val="es-ES"/>
         </w:rPr>
-        <w:lastRenderedPageBreak/>
-        <w:t>6</w:t>
+        <w:t>5</w:t>
       </w:r>
       <w:r>
         <w:rPr>
@@ -5340,7 +5301,7 @@
           <w:szCs w:val="24"/>
           <w:lang w:val="es-ES"/>
         </w:rPr>
-        <w:t>7</w:t>
+        <w:t>6</w:t>
       </w:r>
       <w:r>
         <w:rPr>
@@ -5575,7 +5536,7 @@
           <w:sz w:val="24"/>
           <w:szCs w:val="24"/>
         </w:rPr>
-        <w:t xml:space="preserve">8. Aplicación obligatoria del Cuestionario de Evaluación Rápida en Comunidades</w:t>
+        <w:t>7. Aplicación obligatoria del Cuestionario de Evaluación Rápida en Comunidades</w:t>
       </w:r>
     </w:p>
     <w:p>
@@ -5720,7 +5681,7 @@
           <w:szCs w:val="24"/>
           <w:lang w:val="es-ES"/>
         </w:rPr>
-        <w:t>9</w:t>
+        <w:t>8</w:t>
       </w:r>
       <w:r>
         <w:rPr>

</xml_diff>

<commit_message>
Fusiona puntos 5 y 6 de Fase 1 en "Mapeo de actores clave" y renumera
Combina "Identificación de autoridades morales" y "Mapeo preliminar de
autoridades gubernamentales y no oficiales" bajo un solo encabezado.
Puntos 7, 8 y 9 renumerados a 6, 7 y 8 respectivamente.
</commit_message>
<xml_diff>
--- a/CRV_Orientaciones_Acceso_y_Legitimacion_2026_v5.docx
+++ b/CRV_Orientaciones_Acceso_y_Legitimacion_2026_v5.docx
@@ -2567,7 +2567,7 @@
           <w:szCs w:val="24"/>
           <w:lang w:val="es-ES"/>
         </w:rPr>
-        <w:t xml:space="preserve">Identificación </w:t>
+        <w:t>Mapeo de actores clave</w:t>
       </w:r>
       <w:r>
         <w:rPr>
@@ -2579,7 +2579,6 @@
           <w:szCs w:val="24"/>
           <w:lang w:val="es-ES"/>
         </w:rPr>
-        <w:t xml:space="preserve">de </w:t>
       </w:r>
       <w:r>
         <w:rPr>
@@ -2591,7 +2590,6 @@
           <w:szCs w:val="24"/>
           <w:lang w:val="es-ES"/>
         </w:rPr>
-        <w:t>autoridades morales</w:t>
       </w:r>
     </w:p>
     <w:p>
@@ -2920,105 +2918,6 @@
     </w:p>
     <w:p>
       <w:pPr>
-        <w:pStyle w:val="Ttulo2"/>
-        <w:jc w:val="both"/>
-        <w:rPr>
-          <w:rFonts w:ascii="Arial" w:hAnsi="Arial" w:cs="Arial"/>
-          <w:b/>
-          <w:bCs/>
-          <w:color w:val="auto"/>
-          <w:sz w:val="24"/>
-          <w:szCs w:val="24"/>
-          <w:lang w:val="es-ES"/>
-        </w:rPr>
-      </w:pPr>
-      <w:r>
-        <w:rPr>
-          <w:rFonts w:ascii="Arial" w:hAnsi="Arial" w:cs="Arial"/>
-          <w:b/>
-          <w:bCs/>
-          <w:color w:val="auto"/>
-          <w:sz w:val="24"/>
-          <w:szCs w:val="24"/>
-          <w:lang w:val="es-ES"/>
-        </w:rPr>
-        <w:t>6</w:t>
-      </w:r>
-      <w:r>
-        <w:rPr>
-          <w:rFonts w:ascii="Arial" w:hAnsi="Arial" w:cs="Arial"/>
-          <w:b/>
-          <w:bCs/>
-          <w:color w:val="auto"/>
-          <w:sz w:val="24"/>
-          <w:szCs w:val="24"/>
-          <w:lang w:val="es-ES"/>
-        </w:rPr>
-        <w:t xml:space="preserve">. </w:t>
-      </w:r>
-      <w:r>
-        <w:rPr>
-          <w:rFonts w:ascii="Arial" w:hAnsi="Arial" w:cs="Arial"/>
-          <w:b/>
-          <w:bCs/>
-          <w:color w:val="auto"/>
-          <w:sz w:val="24"/>
-          <w:szCs w:val="24"/>
-          <w:lang w:val="es-ES"/>
-        </w:rPr>
-        <w:t xml:space="preserve">Mapeo </w:t>
-      </w:r>
-      <w:r>
-        <w:rPr>
-          <w:rFonts w:ascii="Arial" w:hAnsi="Arial" w:cs="Arial"/>
-          <w:b/>
-          <w:bCs/>
-          <w:color w:val="auto"/>
-          <w:sz w:val="24"/>
-          <w:szCs w:val="24"/>
-          <w:lang w:val="es-ES"/>
-        </w:rPr>
-        <w:t xml:space="preserve">preliminar de autoridades </w:t>
-      </w:r>
-      <w:r>
-        <w:rPr>
-          <w:rFonts w:ascii="Arial" w:hAnsi="Arial" w:cs="Arial"/>
-          <w:b/>
-          <w:bCs/>
-          <w:color w:val="auto"/>
-          <w:sz w:val="24"/>
-          <w:szCs w:val="24"/>
-          <w:lang w:val="es-ES"/>
-        </w:rPr>
-        <w:t>gubernamentales</w:t>
-      </w:r>
-      <w:r>
-        <w:rPr>
-          <w:rFonts w:ascii="Arial" w:hAnsi="Arial" w:cs="Arial"/>
-          <w:b/>
-          <w:bCs/>
-          <w:color w:val="auto"/>
-          <w:sz w:val="24"/>
-          <w:szCs w:val="24"/>
-          <w:lang w:val="es-ES"/>
-        </w:rPr>
-        <w:t xml:space="preserve"> y </w:t>
-      </w:r>
-      <w:r>
-        <w:rPr>
-          <w:rFonts w:ascii="Arial" w:hAnsi="Arial" w:cs="Arial"/>
-          <w:b/>
-          <w:bCs/>
-          <w:color w:val="auto"/>
-          <w:sz w:val="24"/>
-          <w:szCs w:val="24"/>
-          <w:lang w:val="es-ES"/>
-        </w:rPr>
-        <w:t>no oficiales</w:t>
-      </w:r>
-    </w:p>
-    <w:p>
-      <w:pPr>
         <w:numPr>
           <w:ilvl w:val="0"/>
           <w:numId w:val="5"/>
@@ -3236,7 +3135,7 @@
           <w:szCs w:val="24"/>
           <w:lang w:val="es-ES"/>
         </w:rPr>
-        <w:t>7</w:t>
+        <w:t>6</w:t>
       </w:r>
       <w:r>
         <w:rPr>
@@ -3450,7 +3349,7 @@
           <w:szCs w:val="24"/>
           <w:lang w:val="es-ES"/>
         </w:rPr>
-        <w:t xml:space="preserve">8. </w:t>
+        <w:t xml:space="preserve">7. </w:t>
       </w:r>
       <w:r>
         <w:rPr>
@@ -3641,7 +3540,7 @@
           <w:szCs w:val="24"/>
           <w:lang w:val="es-ES"/>
         </w:rPr>
-        <w:t>9</w:t>
+        <w:t>8</w:t>
       </w:r>
       <w:r>
         <w:rPr>

</xml_diff>

<commit_message>
Mueve contenido del punto 6 de Fase 1 al punto 3 y elimina punto 6
El contenido de "Análisis de capacidad y lecciones aprendidas" (preguntar
por proyectos previos y gestionar desconfianza) se incorpora al final del
punto 3 "Auditoría de datos secundarios y sesgos". Puntos 7 y 8 renumerados
a 6 y 7.
</commit_message>
<xml_diff>
--- a/CRV_Orientaciones_Acceso_y_Legitimacion_2026_v5.docx
+++ b/CRV_Orientaciones_Acceso_y_Legitimacion_2026_v5.docx
@@ -1969,6 +1969,157 @@
           <w:lang w:val="es-ES"/>
         </w:rPr>
         <w:t xml:space="preserve">. </w:t>
+      </w:r>
+    </w:p>
+    <w:p>
+      <w:pPr>
+        <w:numPr>
+          <w:ilvl w:val="0"/>
+          <w:numId w:val="5"/>
+        </w:numPr>
+        <w:jc w:val="both"/>
+        <w:rPr>
+          <w:rFonts w:ascii="Arial" w:hAnsi="Arial" w:cs="Arial"/>
+          <w:lang w:val="es-ES"/>
+        </w:rPr>
+      </w:pPr>
+      <w:r>
+        <w:rPr>
+          <w:rFonts w:ascii="Arial" w:hAnsi="Arial" w:cs="Arial"/>
+          <w:b/>
+          <w:bCs/>
+          <w:lang w:val="es-ES"/>
+        </w:rPr>
+        <w:t>Acción:</w:t>
+      </w:r>
+      <w:r>
+        <w:rPr>
+          <w:rFonts w:ascii="Arial" w:hAnsi="Arial" w:cs="Arial"/>
+          <w:lang w:val="es-ES"/>
+        </w:rPr>
+        <w:t xml:space="preserve"> </w:t>
+      </w:r>
+      <w:r>
+        <w:rPr>
+          <w:rFonts w:ascii="Arial" w:hAnsi="Arial" w:cs="Arial"/>
+          <w:lang w:val="es-ES"/>
+        </w:rPr>
+        <w:t>Preguntar</w:t>
+      </w:r>
+      <w:r>
+        <w:rPr>
+          <w:rFonts w:ascii="Arial" w:hAnsi="Arial" w:cs="Arial"/>
+          <w:lang w:val="es-ES"/>
+        </w:rPr>
+        <w:t xml:space="preserve"> si</w:t>
+      </w:r>
+      <w:r>
+        <w:rPr>
+          <w:rFonts w:ascii="Arial" w:hAnsi="Arial" w:cs="Arial"/>
+          <w:lang w:val="es-ES"/>
+        </w:rPr>
+        <w:t xml:space="preserve"> la comunidad participó anteriormente</w:t>
+      </w:r>
+      <w:r>
+        <w:rPr>
+          <w:rFonts w:ascii="Arial" w:hAnsi="Arial" w:cs="Arial"/>
+          <w:lang w:val="es-ES"/>
+        </w:rPr>
+        <w:t xml:space="preserve"> en proyectos parecidos</w:t>
+      </w:r>
+      <w:r>
+        <w:rPr>
+          <w:rFonts w:ascii="Arial" w:hAnsi="Arial" w:cs="Arial"/>
+          <w:lang w:val="es-ES"/>
+        </w:rPr>
+        <w:t xml:space="preserve">, si </w:t>
+      </w:r>
+      <w:r>
+        <w:rPr>
+          <w:rFonts w:ascii="Arial" w:hAnsi="Arial" w:cs="Arial"/>
+          <w:lang w:val="es-ES"/>
+        </w:rPr>
+        <w:t>tuvieron éxito o</w:t>
+      </w:r>
+      <w:r>
+        <w:rPr>
+          <w:rFonts w:ascii="Arial" w:hAnsi="Arial" w:cs="Arial"/>
+          <w:lang w:val="es-ES"/>
+        </w:rPr>
+        <w:t xml:space="preserve"> si</w:t>
+      </w:r>
+      <w:r>
+        <w:rPr>
+          <w:rFonts w:ascii="Arial" w:hAnsi="Arial" w:cs="Arial"/>
+          <w:lang w:val="es-ES"/>
+        </w:rPr>
+        <w:t xml:space="preserve"> </w:t>
+      </w:r>
+      <w:r>
+        <w:rPr>
+          <w:rFonts w:ascii="Arial" w:hAnsi="Arial" w:cs="Arial"/>
+          <w:lang w:val="es-ES"/>
+        </w:rPr>
+        <w:t>hubo</w:t>
+      </w:r>
+      <w:r>
+        <w:rPr>
+          <w:rFonts w:ascii="Arial" w:hAnsi="Arial" w:cs="Arial"/>
+          <w:lang w:val="es-ES"/>
+        </w:rPr>
+        <w:t xml:space="preserve"> conflictos.</w:t>
+      </w:r>
+    </w:p>
+    <w:p>
+      <w:pPr>
+        <w:numPr>
+          <w:ilvl w:val="0"/>
+          <w:numId w:val="5"/>
+        </w:numPr>
+        <w:jc w:val="both"/>
+        <w:rPr>
+          <w:rFonts w:ascii="Arial" w:hAnsi="Arial" w:cs="Arial"/>
+          <w:lang w:val="es-ES"/>
+        </w:rPr>
+      </w:pPr>
+      <w:r>
+        <w:rPr>
+          <w:rFonts w:ascii="Arial" w:hAnsi="Arial" w:cs="Arial"/>
+          <w:b/>
+          <w:bCs/>
+          <w:lang w:val="es-ES"/>
+        </w:rPr>
+        <w:t>Estrategia de campo</w:t>
+      </w:r>
+      <w:r>
+        <w:rPr>
+          <w:rFonts w:ascii="Arial" w:hAnsi="Arial" w:cs="Arial"/>
+          <w:b/>
+          <w:bCs/>
+          <w:lang w:val="es-ES"/>
+        </w:rPr>
+        <w:t>:</w:t>
+      </w:r>
+      <w:r>
+        <w:rPr>
+          <w:rFonts w:ascii="Arial" w:hAnsi="Arial" w:cs="Arial"/>
+          <w:lang w:val="es-ES"/>
+        </w:rPr>
+        <w:t xml:space="preserve"> </w:t>
+      </w:r>
+      <w:r>
+        <w:rPr>
+          <w:rFonts w:ascii="Arial" w:hAnsi="Arial" w:cs="Arial"/>
+          <w:lang w:val="es-ES"/>
+        </w:rPr>
+        <w:t>Anticipar</w:t>
+      </w:r>
+      <w:r>
+        <w:rPr>
+          <w:rFonts w:ascii="Arial" w:hAnsi="Arial" w:cs="Arial"/>
+          <w:lang w:val="es-ES"/>
+        </w:rPr>
+        <w:t xml:space="preserve"> estrategias para gestionar la desconfianza si hubo malas experiencias previas.</w:t>
       </w:r>
     </w:p>
     <w:p>
@@ -3135,221 +3286,7 @@
           <w:szCs w:val="24"/>
           <w:lang w:val="es-ES"/>
         </w:rPr>
-        <w:t>6</w:t>
-      </w:r>
-      <w:r>
-        <w:rPr>
-          <w:rFonts w:ascii="Arial" w:hAnsi="Arial" w:cs="Arial"/>
-          <w:b/>
-          <w:bCs/>
-          <w:color w:val="auto"/>
-          <w:sz w:val="24"/>
-          <w:szCs w:val="24"/>
-          <w:lang w:val="es-ES"/>
-        </w:rPr>
-        <w:t xml:space="preserve">. </w:t>
-      </w:r>
-      <w:r>
-        <w:rPr>
-          <w:rFonts w:ascii="Arial" w:hAnsi="Arial" w:cs="Arial"/>
-          <w:b/>
-          <w:bCs/>
-          <w:color w:val="auto"/>
-          <w:sz w:val="24"/>
-          <w:szCs w:val="24"/>
-          <w:lang w:val="es-ES"/>
-        </w:rPr>
-        <w:t xml:space="preserve">Análisis de </w:t>
-      </w:r>
-      <w:r>
-        <w:rPr>
-          <w:rFonts w:ascii="Arial" w:hAnsi="Arial" w:cs="Arial"/>
-          <w:b/>
-          <w:bCs/>
-          <w:color w:val="auto"/>
-          <w:sz w:val="24"/>
-          <w:szCs w:val="24"/>
-          <w:lang w:val="es-ES"/>
-        </w:rPr>
-        <w:t>capacidad y lecciones aprendidas</w:t>
-      </w:r>
-    </w:p>
-    <w:p>
-      <w:pPr>
-        <w:numPr>
-          <w:ilvl w:val="0"/>
-          <w:numId w:val="5"/>
-        </w:numPr>
-        <w:jc w:val="both"/>
-        <w:rPr>
-          <w:rFonts w:ascii="Arial" w:hAnsi="Arial" w:cs="Arial"/>
-          <w:lang w:val="es-ES"/>
-        </w:rPr>
-      </w:pPr>
-      <w:r>
-        <w:rPr>
-          <w:rFonts w:ascii="Arial" w:hAnsi="Arial" w:cs="Arial"/>
-          <w:b/>
-          <w:bCs/>
-          <w:lang w:val="es-ES"/>
-        </w:rPr>
-        <w:t>Acción:</w:t>
-      </w:r>
-      <w:r>
-        <w:rPr>
-          <w:rFonts w:ascii="Arial" w:hAnsi="Arial" w:cs="Arial"/>
-          <w:lang w:val="es-ES"/>
-        </w:rPr>
-        <w:t xml:space="preserve"> </w:t>
-      </w:r>
-      <w:r>
-        <w:rPr>
-          <w:rFonts w:ascii="Arial" w:hAnsi="Arial" w:cs="Arial"/>
-          <w:lang w:val="es-ES"/>
-        </w:rPr>
-        <w:t>Preguntar</w:t>
-      </w:r>
-      <w:r>
-        <w:rPr>
-          <w:rFonts w:ascii="Arial" w:hAnsi="Arial" w:cs="Arial"/>
-          <w:lang w:val="es-ES"/>
-        </w:rPr>
-        <w:t xml:space="preserve"> si</w:t>
-      </w:r>
-      <w:r>
-        <w:rPr>
-          <w:rFonts w:ascii="Arial" w:hAnsi="Arial" w:cs="Arial"/>
-          <w:lang w:val="es-ES"/>
-        </w:rPr>
-        <w:t xml:space="preserve"> la comunidad participó anteriormente</w:t>
-      </w:r>
-      <w:r>
-        <w:rPr>
-          <w:rFonts w:ascii="Arial" w:hAnsi="Arial" w:cs="Arial"/>
-          <w:lang w:val="es-ES"/>
-        </w:rPr>
-        <w:t xml:space="preserve"> en proyectos parecidos</w:t>
-      </w:r>
-      <w:r>
-        <w:rPr>
-          <w:rFonts w:ascii="Arial" w:hAnsi="Arial" w:cs="Arial"/>
-          <w:lang w:val="es-ES"/>
-        </w:rPr>
-        <w:t xml:space="preserve">, si </w:t>
-      </w:r>
-      <w:r>
-        <w:rPr>
-          <w:rFonts w:ascii="Arial" w:hAnsi="Arial" w:cs="Arial"/>
-          <w:lang w:val="es-ES"/>
-        </w:rPr>
-        <w:t>tuvieron éxito o</w:t>
-      </w:r>
-      <w:r>
-        <w:rPr>
-          <w:rFonts w:ascii="Arial" w:hAnsi="Arial" w:cs="Arial"/>
-          <w:lang w:val="es-ES"/>
-        </w:rPr>
-        <w:t xml:space="preserve"> si</w:t>
-      </w:r>
-      <w:r>
-        <w:rPr>
-          <w:rFonts w:ascii="Arial" w:hAnsi="Arial" w:cs="Arial"/>
-          <w:lang w:val="es-ES"/>
-        </w:rPr>
-        <w:t xml:space="preserve"> </w:t>
-      </w:r>
-      <w:r>
-        <w:rPr>
-          <w:rFonts w:ascii="Arial" w:hAnsi="Arial" w:cs="Arial"/>
-          <w:lang w:val="es-ES"/>
-        </w:rPr>
-        <w:t>hubo</w:t>
-      </w:r>
-      <w:r>
-        <w:rPr>
-          <w:rFonts w:ascii="Arial" w:hAnsi="Arial" w:cs="Arial"/>
-          <w:lang w:val="es-ES"/>
-        </w:rPr>
-        <w:t xml:space="preserve"> conflictos.</w:t>
-      </w:r>
-    </w:p>
-    <w:p>
-      <w:pPr>
-        <w:numPr>
-          <w:ilvl w:val="0"/>
-          <w:numId w:val="5"/>
-        </w:numPr>
-        <w:jc w:val="both"/>
-        <w:rPr>
-          <w:rFonts w:ascii="Arial" w:hAnsi="Arial" w:cs="Arial"/>
-          <w:lang w:val="es-ES"/>
-        </w:rPr>
-      </w:pPr>
-      <w:r>
-        <w:rPr>
-          <w:rFonts w:ascii="Arial" w:hAnsi="Arial" w:cs="Arial"/>
-          <w:b/>
-          <w:bCs/>
-          <w:lang w:val="es-ES"/>
-        </w:rPr>
-        <w:t>Estrategia de campo</w:t>
-      </w:r>
-      <w:r>
-        <w:rPr>
-          <w:rFonts w:ascii="Arial" w:hAnsi="Arial" w:cs="Arial"/>
-          <w:b/>
-          <w:bCs/>
-          <w:lang w:val="es-ES"/>
-        </w:rPr>
-        <w:t>:</w:t>
-      </w:r>
-      <w:r>
-        <w:rPr>
-          <w:rFonts w:ascii="Arial" w:hAnsi="Arial" w:cs="Arial"/>
-          <w:lang w:val="es-ES"/>
-        </w:rPr>
-        <w:t xml:space="preserve"> </w:t>
-      </w:r>
-      <w:r>
-        <w:rPr>
-          <w:rFonts w:ascii="Arial" w:hAnsi="Arial" w:cs="Arial"/>
-          <w:lang w:val="es-ES"/>
-        </w:rPr>
-        <w:t>Anticipar</w:t>
-      </w:r>
-      <w:r>
-        <w:rPr>
-          <w:rFonts w:ascii="Arial" w:hAnsi="Arial" w:cs="Arial"/>
-          <w:lang w:val="es-ES"/>
-        </w:rPr>
-        <w:t xml:space="preserve"> estrategias para gestionar la desconfianza si hubo malas experiencias previas.</w:t>
-      </w:r>
-    </w:p>
-    <w:p>
-      <w:pPr>
-        <w:pStyle w:val="Ttulo2"/>
-        <w:jc w:val="both"/>
-        <w:rPr>
-          <w:rFonts w:ascii="Arial" w:hAnsi="Arial" w:cs="Arial"/>
-          <w:b/>
-          <w:bCs/>
-          <w:color w:val="auto"/>
-          <w:sz w:val="24"/>
-          <w:szCs w:val="24"/>
-          <w:lang w:val="es-ES"/>
-        </w:rPr>
-      </w:pPr>
-      <w:r>
-        <w:rPr>
-          <w:rFonts w:ascii="Arial" w:hAnsi="Arial" w:cs="Arial"/>
-          <w:b/>
-          <w:bCs/>
-          <w:color w:val="auto"/>
-          <w:sz w:val="24"/>
-          <w:szCs w:val="24"/>
-          <w:lang w:val="es-ES"/>
-        </w:rPr>
-        <w:t xml:space="preserve">7. </w:t>
+        <w:t xml:space="preserve">6. </w:t>
       </w:r>
       <w:r>
         <w:rPr>
@@ -3540,7 +3477,7 @@
           <w:szCs w:val="24"/>
           <w:lang w:val="es-ES"/>
         </w:rPr>
-        <w:t>8</w:t>
+        <w:t>7</w:t>
       </w:r>
       <w:r>
         <w:rPr>

</xml_diff>

<commit_message>
Reduce punto 6 de Fase 1 a criterio en punto 1 y lo elimina
"Historia de desastres como variable de priorización" se condensa en un
criterio adicional dentro del protocolo de priorización (punto 1). El
punto 6 completo es eliminado. Documentos de consulta renumerado a 6.
</commit_message>
<xml_diff>
--- a/CRV_Orientaciones_Acceso_y_Legitimacion_2026_v5.docx
+++ b/CRV_Orientaciones_Acceso_y_Legitimacion_2026_v5.docx
@@ -1397,6 +1397,30 @@
           <w:lang w:val="es-ES"/>
         </w:rPr>
         <w:t xml:space="preserve"> El problema que se busca atender está dentro del mandato y las competencias técnicas de la filial.</w:t>
+      </w:r>
+    </w:p>
+    <w:p>
+      <w:pPr>
+        <w:numPr>
+          <w:ilvl w:val="0"/>
+          <w:numId w:val="28"/>
+        </w:numPr>
+        <w:rPr>
+          <w:lang w:val="es-ES"/>
+        </w:rPr>
+      </w:pPr>
+      <w:r>
+        <w:rPr>
+          <w:rFonts w:ascii="Arial" w:hAnsi="Arial"/>
+          <w:b/>
+        </w:rPr>
+        <w:t xml:space="preserve">Historia de desastre reciente:</w:t>
+      </w:r>
+      <w:r>
+        <w:rPr>
+          <w:rFonts w:ascii="Arial" w:hAnsi="Arial"/>
+        </w:rPr>
+        <w:t xml:space="preserve"> Las comunidades que han vivido un evento de desastre muestran mayor disposición a participar, mejor convocatoria y mayor capacidad de replicar lo aprendido. Si existen comunidades candidatas con condiciones operativas comparables, priorizar aquellas con historia reciente de desastre como punto de entrada.</w:t>
       </w:r>
     </w:p>
     <w:p>
@@ -3268,8 +3292,6 @@
         <w:jc w:val="both"/>
         <w:rPr>
           <w:rFonts w:ascii="Arial" w:hAnsi="Arial" w:cs="Arial"/>
-          <w:b/>
-          <w:bCs/>
           <w:color w:val="auto"/>
           <w:sz w:val="24"/>
           <w:szCs w:val="24"/>
@@ -3286,198 +3308,7 @@
           <w:szCs w:val="24"/>
           <w:lang w:val="es-ES"/>
         </w:rPr>
-        <w:t xml:space="preserve">6. </w:t>
-      </w:r>
-      <w:r>
-        <w:rPr>
-          <w:rFonts w:ascii="Arial" w:hAnsi="Arial" w:cs="Arial"/>
-          <w:b/>
-          <w:bCs/>
-          <w:color w:val="auto"/>
-          <w:sz w:val="24"/>
-          <w:szCs w:val="24"/>
-          <w:lang w:val="es-ES"/>
-        </w:rPr>
-        <w:t>Historia de desastres como variable de priorización</w:t>
-      </w:r>
-    </w:p>
-    <w:p>
-      <w:pPr>
-        <w:jc w:val="both"/>
-        <w:rPr>
-          <w:rFonts w:ascii="Arial" w:hAnsi="Arial" w:cs="Arial"/>
-          <w:lang w:val="es-ES"/>
-        </w:rPr>
-      </w:pPr>
-      <w:r>
-        <w:rPr>
-          <w:rFonts w:ascii="Arial" w:hAnsi="Arial" w:cs="Arial"/>
-          <w:b/>
-          <w:bCs/>
-          <w:lang w:val="es-ES"/>
-        </w:rPr>
-        <w:t>Acción:</w:t>
-      </w:r>
-      <w:r>
-        <w:rPr>
-          <w:rFonts w:ascii="Arial" w:hAnsi="Arial" w:cs="Arial"/>
-          <w:lang w:val="es-ES"/>
-        </w:rPr>
-        <w:t xml:space="preserve"> Además de indagar si la comunidad ha participado en proyectos anteriores, la filial debe identificar si ha vivido eventos de desastre recientes —inundaciones, deslizamientos, sismos, incendios u otros—. Esta información no solo enriquece el diagnóstico de riesgo: es un indicador de viabilidad operativa, ya que las comunidades con experiencia directa en desastres tienden a mostrar mayor disposición a participar, mayor cohesión durante las actividades y mayor capacidad de replicar lo aprendido.</w:t>
-      </w:r>
-    </w:p>
-    <w:p>
-      <w:pPr>
-        <w:jc w:val="both"/>
-        <w:rPr>
-          <w:rFonts w:ascii="Arial" w:hAnsi="Arial" w:cs="Arial"/>
-          <w:lang w:val="es-ES"/>
-        </w:rPr>
-      </w:pPr>
-      <w:r>
-        <w:rPr>
-          <w:rFonts w:ascii="Arial" w:hAnsi="Arial" w:cs="Arial"/>
-          <w:b/>
-          <w:bCs/>
-          <w:lang w:val="es-ES"/>
-        </w:rPr>
-        <w:t>Por qué esta variable importa:</w:t>
-      </w:r>
-    </w:p>
-    <w:p>
-      <w:pPr>
-        <w:numPr>
-          <w:ilvl w:val="0"/>
-          <w:numId w:val="39"/>
-        </w:numPr>
-        <w:jc w:val="both"/>
-        <w:rPr>
-          <w:rFonts w:ascii="Arial" w:hAnsi="Arial" w:cs="Arial"/>
-          <w:lang w:val="es-ES"/>
-        </w:rPr>
-      </w:pPr>
-      <w:r>
-        <w:rPr>
-          <w:rFonts w:ascii="Arial" w:hAnsi="Arial" w:cs="Arial"/>
-          <w:lang w:val="es-ES"/>
-        </w:rPr>
-        <w:t>Las comunidades que han vivido un desastre conocen de forma directa la diferencia entre estar preparadas y no estarlo, lo que genera motivación intrínseca que otras comunidades no tienen.</w:t>
-      </w:r>
-    </w:p>
-    <w:p>
-      <w:pPr>
-        <w:numPr>
-          <w:ilvl w:val="0"/>
-          <w:numId w:val="39"/>
-        </w:numPr>
-        <w:jc w:val="both"/>
-        <w:rPr>
-          <w:rFonts w:ascii="Arial" w:hAnsi="Arial" w:cs="Arial"/>
-          <w:lang w:val="es-ES"/>
-        </w:rPr>
-      </w:pPr>
-      <w:r>
-        <w:rPr>
-          <w:rFonts w:ascii="Arial" w:hAnsi="Arial" w:cs="Arial"/>
-          <w:lang w:val="es-ES"/>
-        </w:rPr>
-        <w:t>La convocatoria es notablemente más efectiva: los participantes se comprometen y permanecen hasta el final de las actividades.</w:t>
-      </w:r>
-    </w:p>
-    <w:p>
-      <w:pPr>
-        <w:numPr>
-          <w:ilvl w:val="0"/>
-          <w:numId w:val="39"/>
-        </w:numPr>
-        <w:jc w:val="both"/>
-        <w:rPr>
-          <w:rFonts w:ascii="Arial" w:hAnsi="Arial" w:cs="Arial"/>
-          <w:lang w:val="es-ES"/>
-        </w:rPr>
-      </w:pPr>
-      <w:r>
-        <w:rPr>
-          <w:rFonts w:ascii="Arial" w:hAnsi="Arial" w:cs="Arial"/>
-          <w:lang w:val="es-ES"/>
-        </w:rPr>
-        <w:t>La capacidad de réplica es mayor: los aprendizajes se transfieren con más facilidad a otras personas de la comunidad y la autonomía operativa se alcanza en menor tiempo.</w:t>
-      </w:r>
-    </w:p>
-    <w:p>
-      <w:pPr>
-        <w:jc w:val="both"/>
-        <w:rPr>
-          <w:rFonts w:ascii="Arial" w:hAnsi="Arial" w:cs="Arial"/>
-          <w:lang w:val="es-ES"/>
-        </w:rPr>
-      </w:pPr>
-      <w:r>
-        <w:rPr>
-          <w:rFonts w:ascii="Arial" w:hAnsi="Arial" w:cs="Arial"/>
-          <w:b/>
-          <w:bCs/>
-          <w:lang w:val="es-ES"/>
-        </w:rPr>
-        <w:lastRenderedPageBreak/>
-        <w:t>Estrategia de campo:</w:t>
-      </w:r>
-      <w:r>
-        <w:rPr>
-          <w:rFonts w:ascii="Arial" w:hAnsi="Arial" w:cs="Arial"/>
-          <w:lang w:val="es-ES"/>
-        </w:rPr>
-        <w:t xml:space="preserve"> Si entre las comunidades candidatas existe una con historia reciente de desastre y condiciones operativas comparables, priorizarla como punto de entrada. Los resultados obtenidos en esa comunidad pueden documentarse como caso de referencia y utilizarse para motivar la participación en comunidades vecinas sin esa experiencia.</w:t>
-      </w:r>
-    </w:p>
-    <w:p>
-      <w:pPr>
-        <w:jc w:val="both"/>
-        <w:rPr>
-          <w:rFonts w:ascii="Arial" w:hAnsi="Arial" w:cs="Arial"/>
-          <w:lang w:val="es-ES"/>
-        </w:rPr>
-      </w:pPr>
-      <w:r>
-        <w:rPr>
-          <w:rFonts w:ascii="Arial" w:hAnsi="Arial" w:cs="Arial"/>
-          <w:b/>
-          <w:bCs/>
-          <w:lang w:val="es-ES"/>
-        </w:rPr>
-        <w:t>Punto crítico:</w:t>
-      </w:r>
-      <w:r>
-        <w:rPr>
-          <w:rFonts w:ascii="Arial" w:hAnsi="Arial" w:cs="Arial"/>
-          <w:lang w:val="es-ES"/>
-        </w:rPr>
-        <w:t xml:space="preserve"> La historia de desastre no garantiza por sí sola la viabilidad del trabajo. Debe cruzarse con los demás criterios del protocolo de priorización: cohesión social, capacidad operativa de la filial y pertinencia del mandato. Una comunidad afectada por un desastre reciente sin proceso de recuperación consolidado puede mostrar el patrón opuesto: desorganización, desconfianza y dificultad para proyectarse hacia la prevención.</w:t>
-      </w:r>
-    </w:p>
-    <w:p>
-      <w:pPr>
-        <w:pStyle w:val="Ttulo2"/>
-        <w:jc w:val="both"/>
-        <w:rPr>
-          <w:rFonts w:ascii="Arial" w:hAnsi="Arial" w:cs="Arial"/>
-          <w:color w:val="auto"/>
-          <w:sz w:val="24"/>
-          <w:szCs w:val="24"/>
-          <w:lang w:val="es-ES"/>
-        </w:rPr>
-      </w:pPr>
-      <w:r>
-        <w:rPr>
-          <w:rFonts w:ascii="Arial" w:hAnsi="Arial" w:cs="Arial"/>
-          <w:b/>
-          <w:bCs/>
-          <w:color w:val="auto"/>
-          <w:sz w:val="24"/>
-          <w:szCs w:val="24"/>
-          <w:lang w:val="es-ES"/>
-        </w:rPr>
-        <w:t>7</w:t>
+        <w:t>6</w:t>
       </w:r>
       <w:r>
         <w:rPr>

</xml_diff>

<commit_message>
Fusiona puntos 1 y 2 de Fase 3 y renumera
Combina "Estrategia de muestreo inclusivo" y "Auditoría de
representatividad de la participación" bajo un solo encabezado.
Puntos 3-10 renumerados a 2-9.
</commit_message>
<xml_diff>
--- a/CRV_Orientaciones_Acceso_y_Legitimacion_2026_v5.docx
+++ b/CRV_Orientaciones_Acceso_y_Legitimacion_2026_v5.docx
@@ -5638,7 +5638,7 @@
           <w:szCs w:val="24"/>
           <w:lang w:val="es-ES"/>
         </w:rPr>
-        <w:t>muestreo inclusivo</w:t>
+        <w:t>muestreo inclusivo y verificación de representatividad</w:t>
       </w:r>
     </w:p>
     <w:p>
@@ -6177,41 +6177,6 @@
     </w:p>
     <w:p>
       <w:pPr>
-        <w:pStyle w:val="Ttulo2"/>
-        <w:rPr>
-          <w:rFonts w:ascii="Arial" w:hAnsi="Arial" w:cs="Arial"/>
-          <w:b/>
-          <w:bCs/>
-          <w:lang w:val="es-ES"/>
-        </w:rPr>
-      </w:pPr>
-      <w:r>
-        <w:rPr>
-          <w:rFonts w:ascii="Arial" w:hAnsi="Arial" w:cs="Arial"/>
-          <w:b/>
-          <w:bCs/>
-          <w:color w:val="auto"/>
-          <w:sz w:val="24"/>
-          <w:szCs w:val="24"/>
-          <w:lang w:val="es-ES"/>
-        </w:rPr>
-        <w:t>2.</w:t>
-      </w:r>
-      <w:r>
-        <w:rPr>
-          <w:rFonts w:ascii="Arial" w:hAnsi="Arial" w:cs="Arial"/>
-          <w:b/>
-          <w:bCs/>
-          <w:color w:val="auto"/>
-          <w:sz w:val="24"/>
-          <w:szCs w:val="24"/>
-          <w:lang w:val="es-ES"/>
-        </w:rPr>
-        <w:t xml:space="preserve"> Auditoría de representatividad de la participación</w:t>
-      </w:r>
-    </w:p>
-    <w:p>
-      <w:pPr>
         <w:jc w:val="both"/>
         <w:rPr>
           <w:rFonts w:ascii="Arial" w:hAnsi="Arial" w:cs="Arial"/>
@@ -6425,7 +6390,7 @@
           <w:szCs w:val="24"/>
           <w:lang w:val="es-ES"/>
         </w:rPr>
-        <w:t>3</w:t>
+        <w:t>2</w:t>
       </w:r>
       <w:r>
         <w:rPr>
@@ -6702,7 +6667,7 @@
           <w:szCs w:val="24"/>
           <w:lang w:val="es-ES"/>
         </w:rPr>
-        <w:t>4</w:t>
+        <w:t>3</w:t>
       </w:r>
       <w:r>
         <w:rPr>
@@ -7038,7 +7003,7 @@
           <w:szCs w:val="24"/>
           <w:lang w:val="es-ES"/>
         </w:rPr>
-        <w:t>5.</w:t>
+        <w:t>4.</w:t>
       </w:r>
       <w:r>
         <w:rPr>
@@ -7302,8 +7267,7 @@
           <w:szCs w:val="24"/>
           <w:lang w:val="es-ES"/>
         </w:rPr>
-        <w:lastRenderedPageBreak/>
-        <w:t>6</w:t>
+        <w:t>5</w:t>
       </w:r>
       <w:r>
         <w:rPr>
@@ -7483,7 +7447,7 @@
           <w:szCs w:val="24"/>
           <w:lang w:val="es-ES"/>
         </w:rPr>
-        <w:t>7.</w:t>
+        <w:t>6.</w:t>
       </w:r>
       <w:r>
         <w:rPr>
@@ -7811,7 +7775,7 @@
           <w:szCs w:val="24"/>
           <w:lang w:val="es-ES"/>
         </w:rPr>
-        <w:t>8</w:t>
+        <w:t>7</w:t>
       </w:r>
       <w:r>
         <w:rPr>
@@ -8140,7 +8104,7 @@
           <w:szCs w:val="24"/>
           <w:lang w:val="es-ES"/>
         </w:rPr>
-        <w:t xml:space="preserve">9. </w:t>
+        <w:t xml:space="preserve">8. </w:t>
       </w:r>
       <w:r>
         <w:rPr>
@@ -8450,7 +8414,7 @@
           <w:szCs w:val="24"/>
           <w:lang w:val="es-ES"/>
         </w:rPr>
-        <w:t>10</w:t>
+        <w:t>9</w:t>
       </w:r>
       <w:r>
         <w:rPr>

</xml_diff>